<commit_message>
ready for defense v3
</commit_message>
<xml_diff>
--- a/docs/Дипломный проект.docx
+++ b/docs/Дипломный проект.docx
@@ -498,7 +498,7 @@
             </w:rPr>
             <w:fldChar w:fldCharType="separate"/>
           </w:r>
-          <w:hyperlink w:anchor="_Toc231119250" w:history="1">
+          <w:hyperlink w:anchor="_Toc231830938" w:history="1">
             <w:r>
               <w:rPr>
                 <w:rStyle w:val="aa"/>
@@ -537,7 +537,7 @@
                 <w:sz w:val="28"/>
                 <w:szCs w:val="28"/>
               </w:rPr>
-              <w:instrText xml:space="preserve"> PAGEREF _Toc231119250 \h </w:instrText>
+              <w:instrText xml:space="preserve"> PAGEREF _Toc231830938 \h </w:instrText>
             </w:r>
             <w:r>
               <w:rPr>
@@ -596,7 +596,7 @@
               <w:lang w:eastAsia="ru-RU"/>
             </w:rPr>
           </w:pPr>
-          <w:hyperlink w:anchor="_Toc231119251" w:history="1">
+          <w:hyperlink w:anchor="_Toc231830939" w:history="1">
             <w:r>
               <w:rPr>
                 <w:rStyle w:val="aa"/>
@@ -635,7 +635,7 @@
                 <w:sz w:val="28"/>
                 <w:szCs w:val="28"/>
               </w:rPr>
-              <w:instrText xml:space="preserve"> PAGEREF _Toc231119251 \h </w:instrText>
+              <w:instrText xml:space="preserve"> PAGEREF _Toc231830939 \h </w:instrText>
             </w:r>
             <w:r>
               <w:rPr>
@@ -695,7 +695,7 @@
               <w:lang w:eastAsia="ru-RU"/>
             </w:rPr>
           </w:pPr>
-          <w:hyperlink w:anchor="_Toc231119252" w:history="1">
+          <w:hyperlink w:anchor="_Toc231830940" w:history="1">
             <w:r>
               <w:rPr>
                 <w:rStyle w:val="aa"/>
@@ -734,7 +734,7 @@
                 <w:sz w:val="28"/>
                 <w:szCs w:val="28"/>
               </w:rPr>
-              <w:instrText xml:space="preserve"> PAGEREF _Toc231119252 \h </w:instrText>
+              <w:instrText xml:space="preserve"> PAGEREF _Toc231830940 \h </w:instrText>
             </w:r>
             <w:r>
               <w:rPr>
@@ -794,7 +794,7 @@
               <w:lang w:eastAsia="ru-RU"/>
             </w:rPr>
           </w:pPr>
-          <w:hyperlink w:anchor="_Toc231119253" w:history="1">
+          <w:hyperlink w:anchor="_Toc231830941" w:history="1">
             <w:r>
               <w:rPr>
                 <w:rStyle w:val="aa"/>
@@ -833,7 +833,7 @@
                 <w:sz w:val="28"/>
                 <w:szCs w:val="28"/>
               </w:rPr>
-              <w:instrText xml:space="preserve"> PAGEREF _Toc231119253 \h </w:instrText>
+              <w:instrText xml:space="preserve"> PAGEREF _Toc231830941 \h </w:instrText>
             </w:r>
             <w:r>
               <w:rPr>
@@ -893,7 +893,7 @@
               <w:lang w:eastAsia="ru-RU"/>
             </w:rPr>
           </w:pPr>
-          <w:hyperlink w:anchor="_Toc231119254" w:history="1">
+          <w:hyperlink w:anchor="_Toc231830942" w:history="1">
             <w:r>
               <w:rPr>
                 <w:rStyle w:val="aa"/>
@@ -932,7 +932,7 @@
                 <w:sz w:val="28"/>
                 <w:szCs w:val="28"/>
               </w:rPr>
-              <w:instrText xml:space="preserve"> PAGEREF _Toc231119254 \h </w:instrText>
+              <w:instrText xml:space="preserve"> PAGEREF _Toc231830942 \h </w:instrText>
             </w:r>
             <w:r>
               <w:rPr>
@@ -991,7 +991,7 @@
               <w:lang w:eastAsia="ru-RU"/>
             </w:rPr>
           </w:pPr>
-          <w:hyperlink w:anchor="_Toc231119255" w:history="1">
+          <w:hyperlink w:anchor="_Toc231830943" w:history="1">
             <w:r>
               <w:rPr>
                 <w:rStyle w:val="aa"/>
@@ -1000,7 +1000,7 @@
                 <w:sz w:val="28"/>
                 <w:szCs w:val="28"/>
               </w:rPr>
-              <w:t>ГЛАВА 2 РАЗРАБОТКА ИНФОРМАЦИОННОЙ СИСТЕМЫ</w:t>
+              <w:t>ГЛАВА 2 РАЗРАБОТКА АВТОМАТИЗИРОВАННОЙ СИСТЕМЫ ДЛЯ БАГЕТНОЙ МАСТЕРСКОЙ</w:t>
             </w:r>
             <w:r>
               <w:rPr>
@@ -1030,7 +1030,7 @@
                 <w:sz w:val="28"/>
                 <w:szCs w:val="28"/>
               </w:rPr>
-              <w:instrText xml:space="preserve"> PAGEREF _Toc231119255 \h </w:instrText>
+              <w:instrText xml:space="preserve"> PAGEREF _Toc231830943 \h </w:instrText>
             </w:r>
             <w:r>
               <w:rPr>
@@ -1090,7 +1090,7 @@
               <w:lang w:eastAsia="ru-RU"/>
             </w:rPr>
           </w:pPr>
-          <w:hyperlink w:anchor="_Toc231119256" w:history="1">
+          <w:hyperlink w:anchor="_Toc231830944" w:history="1">
             <w:r>
               <w:rPr>
                 <w:rStyle w:val="aa"/>
@@ -1129,7 +1129,7 @@
                 <w:sz w:val="28"/>
                 <w:szCs w:val="28"/>
               </w:rPr>
-              <w:instrText xml:space="preserve"> PAGEREF _Toc231119256 \h </w:instrText>
+              <w:instrText xml:space="preserve"> PAGEREF _Toc231830944 \h </w:instrText>
             </w:r>
             <w:r>
               <w:rPr>
@@ -1189,7 +1189,7 @@
               <w:lang w:eastAsia="ru-RU"/>
             </w:rPr>
           </w:pPr>
-          <w:hyperlink w:anchor="_Toc231119257" w:history="1">
+          <w:hyperlink w:anchor="_Toc231830945" w:history="1">
             <w:r>
               <w:rPr>
                 <w:rStyle w:val="aa"/>
@@ -1228,7 +1228,7 @@
                 <w:sz w:val="28"/>
                 <w:szCs w:val="28"/>
               </w:rPr>
-              <w:instrText xml:space="preserve"> PAGEREF _Toc231119257 \h </w:instrText>
+              <w:instrText xml:space="preserve"> PAGEREF _Toc231830945 \h </w:instrText>
             </w:r>
             <w:r>
               <w:rPr>
@@ -1288,7 +1288,7 @@
               <w:lang w:eastAsia="ru-RU"/>
             </w:rPr>
           </w:pPr>
-          <w:hyperlink w:anchor="_Toc231119258" w:history="1">
+          <w:hyperlink w:anchor="_Toc231830946" w:history="1">
             <w:r>
               <w:rPr>
                 <w:rStyle w:val="aa"/>
@@ -1327,7 +1327,7 @@
                 <w:sz w:val="28"/>
                 <w:szCs w:val="28"/>
               </w:rPr>
-              <w:instrText xml:space="preserve"> PAGEREF _Toc231119258 \h </w:instrText>
+              <w:instrText xml:space="preserve"> PAGEREF _Toc231830946 \h </w:instrText>
             </w:r>
             <w:r>
               <w:rPr>
@@ -1387,7 +1387,7 @@
               <w:lang w:eastAsia="ru-RU"/>
             </w:rPr>
           </w:pPr>
-          <w:hyperlink w:anchor="_Toc231119259" w:history="1">
+          <w:hyperlink w:anchor="_Toc231830947" w:history="1">
             <w:r>
               <w:rPr>
                 <w:rStyle w:val="aa"/>
@@ -1426,7 +1426,7 @@
                 <w:sz w:val="28"/>
                 <w:szCs w:val="28"/>
               </w:rPr>
-              <w:instrText xml:space="preserve"> PAGEREF _Toc231119259 \h </w:instrText>
+              <w:instrText xml:space="preserve"> PAGEREF _Toc231830947 \h </w:instrText>
             </w:r>
             <w:r>
               <w:rPr>
@@ -1485,7 +1485,7 @@
               <w:lang w:eastAsia="ru-RU"/>
             </w:rPr>
           </w:pPr>
-          <w:hyperlink w:anchor="_Toc231119260" w:history="1">
+          <w:hyperlink w:anchor="_Toc231830948" w:history="1">
             <w:r>
               <w:rPr>
                 <w:rStyle w:val="aa"/>
@@ -1524,7 +1524,7 @@
                 <w:sz w:val="28"/>
                 <w:szCs w:val="28"/>
               </w:rPr>
-              <w:instrText xml:space="preserve"> PAGEREF _Toc231119260 \h </w:instrText>
+              <w:instrText xml:space="preserve"> PAGEREF _Toc231830948 \h </w:instrText>
             </w:r>
             <w:r>
               <w:rPr>
@@ -1583,7 +1583,7 @@
               <w:lang w:eastAsia="ru-RU"/>
             </w:rPr>
           </w:pPr>
-          <w:hyperlink w:anchor="_Toc231119261" w:history="1">
+          <w:hyperlink w:anchor="_Toc231830949" w:history="1">
             <w:r>
               <w:rPr>
                 <w:rStyle w:val="aa"/>
@@ -1622,7 +1622,7 @@
                 <w:sz w:val="28"/>
                 <w:szCs w:val="28"/>
               </w:rPr>
-              <w:instrText xml:space="preserve"> PAGEREF _Toc231119261 \h </w:instrText>
+              <w:instrText xml:space="preserve"> PAGEREF _Toc231830949 \h </w:instrText>
             </w:r>
             <w:r>
               <w:rPr>
@@ -1681,7 +1681,7 @@
               <w:lang w:eastAsia="ru-RU"/>
             </w:rPr>
           </w:pPr>
-          <w:hyperlink w:anchor="_Toc231119262" w:history="1">
+          <w:hyperlink w:anchor="_Toc231830950" w:history="1">
             <w:r>
               <w:rPr>
                 <w:rStyle w:val="aa"/>
@@ -1741,7 +1741,7 @@
                 <w:sz w:val="28"/>
                 <w:szCs w:val="28"/>
               </w:rPr>
-              <w:instrText xml:space="preserve"> PAGEREF _Toc231119262 \h </w:instrText>
+              <w:instrText xml:space="preserve"> PAGEREF _Toc231830950 \h </w:instrText>
             </w:r>
             <w:r>
               <w:rPr>
@@ -1800,7 +1800,7 @@
               <w:lang w:eastAsia="ru-RU"/>
             </w:rPr>
           </w:pPr>
-          <w:hyperlink w:anchor="_Toc231119263" w:history="1">
+          <w:hyperlink w:anchor="_Toc231830951" w:history="1">
             <w:r>
               <w:rPr>
                 <w:rStyle w:val="aa"/>
@@ -1860,7 +1860,7 @@
                 <w:sz w:val="28"/>
                 <w:szCs w:val="28"/>
               </w:rPr>
-              <w:instrText xml:space="preserve"> PAGEREF _Toc231119263 \h </w:instrText>
+              <w:instrText xml:space="preserve"> PAGEREF _Toc231830951 \h </w:instrText>
             </w:r>
             <w:r>
               <w:rPr>
@@ -1919,7 +1919,7 @@
               <w:lang w:eastAsia="ru-RU"/>
             </w:rPr>
           </w:pPr>
-          <w:hyperlink w:anchor="_Toc231119264" w:history="1">
+          <w:hyperlink w:anchor="_Toc231830952" w:history="1">
             <w:r>
               <w:rPr>
                 <w:rStyle w:val="aa"/>
@@ -1958,7 +1958,7 @@
                 <w:sz w:val="28"/>
                 <w:szCs w:val="28"/>
               </w:rPr>
-              <w:instrText xml:space="preserve"> PAGEREF _Toc231119264 \h </w:instrText>
+              <w:instrText xml:space="preserve"> PAGEREF _Toc231830952 \h </w:instrText>
             </w:r>
             <w:r>
               <w:rPr>
@@ -2017,7 +2017,7 @@
               <w:lang w:eastAsia="ru-RU"/>
             </w:rPr>
           </w:pPr>
-          <w:hyperlink w:anchor="_Toc231119265" w:history="1">
+          <w:hyperlink w:anchor="_Toc231830953" w:history="1">
             <w:r>
               <w:rPr>
                 <w:rStyle w:val="aa"/>
@@ -2056,7 +2056,7 @@
                 <w:sz w:val="28"/>
                 <w:szCs w:val="28"/>
               </w:rPr>
-              <w:instrText xml:space="preserve"> PAGEREF _Toc231119265 \h </w:instrText>
+              <w:instrText xml:space="preserve"> PAGEREF _Toc231830953 \h </w:instrText>
             </w:r>
             <w:r>
               <w:rPr>
@@ -2115,7 +2115,7 @@
               <w:lang w:eastAsia="ru-RU"/>
             </w:rPr>
           </w:pPr>
-          <w:hyperlink w:anchor="_Toc231119266" w:history="1">
+          <w:hyperlink w:anchor="_Toc231830954" w:history="1">
             <w:r>
               <w:rPr>
                 <w:rStyle w:val="aa"/>
@@ -2154,7 +2154,7 @@
                 <w:sz w:val="28"/>
                 <w:szCs w:val="28"/>
               </w:rPr>
-              <w:instrText xml:space="preserve"> PAGEREF _Toc231119266 \h </w:instrText>
+              <w:instrText xml:space="preserve"> PAGEREF _Toc231830954 \h </w:instrText>
             </w:r>
             <w:r>
               <w:rPr>
@@ -2245,7 +2245,7 @@
         <w:ind w:firstLine="0"/>
         <w:jc w:val="center"/>
       </w:pPr>
-      <w:bookmarkStart w:id="0" w:name="_Toc231119250"/>
+      <w:bookmarkStart w:id="0" w:name="_Toc231830938"/>
       <w:r>
         <w:lastRenderedPageBreak/>
         <w:t>ВВЕДЕНИЕ</w:t>
@@ -2781,28 +2781,50 @@
     </w:p>
     <w:p>
       <w:pPr>
-        <w:spacing w:line="360" w:lineRule="auto"/>
-        <w:rPr>
-          <w:rFonts w:ascii="Times New Roman" w:hAnsi="Times New Roman" w:cs="Times New Roman"/>
-          <w:sz w:val="28"/>
-          <w:szCs w:val="28"/>
-        </w:rPr>
-      </w:pPr>
-      <w:r>
-        <w:rPr>
-          <w:rFonts w:ascii="Times New Roman" w:hAnsi="Times New Roman" w:cs="Times New Roman"/>
-          <w:sz w:val="28"/>
-          <w:szCs w:val="28"/>
-        </w:rPr>
-        <w:br w:type="page"/>
+        <w:spacing w:after="0" w:line="360" w:lineRule="auto"/>
+        <w:ind w:firstLine="709"/>
+        <w:jc w:val="both"/>
+        <w:rPr>
+          <w:rFonts w:ascii="Times New Roman" w:hAnsi="Times New Roman" w:cs="Times New Roman"/>
+          <w:sz w:val="28"/>
+          <w:szCs w:val="28"/>
+        </w:rPr>
+      </w:pPr>
+      <w:r>
+        <w:rPr>
+          <w:rFonts w:ascii="Times New Roman" w:hAnsi="Times New Roman" w:cs="Times New Roman"/>
+          <w:bCs/>
+          <w:color w:val="000000" w:themeColor="text1"/>
+          <w:sz w:val="28"/>
+          <w:szCs w:val="28"/>
+        </w:rPr>
+        <w:t>Структура работы: работа состоит из введения, двух глав, заключения, списка используемых источников и пяти приложений. Во введении обоснована актуальность темы. В первой главе описан анализ предметной области багетной мастерской и выбор средств разработки. Вторая глава посвящена проектированию архитектуры, разработке интерфейса, руководству пользователя и тестированию. Заключение отражает результат достижения цели работы. Список используемых источников насчитывает 20 источников.</w:t>
       </w:r>
     </w:p>
     <w:p>
       <w:pPr>
+        <w:spacing w:line="360" w:lineRule="auto"/>
+        <w:rPr>
+          <w:rFonts w:ascii="Times New Roman" w:hAnsi="Times New Roman" w:cs="Times New Roman"/>
+          <w:sz w:val="28"/>
+          <w:szCs w:val="28"/>
+        </w:rPr>
+      </w:pPr>
+      <w:r>
+        <w:rPr>
+          <w:rFonts w:ascii="Times New Roman" w:hAnsi="Times New Roman" w:cs="Times New Roman"/>
+          <w:sz w:val="28"/>
+          <w:szCs w:val="28"/>
+        </w:rPr>
+        <w:br w:type="page"/>
+      </w:r>
+    </w:p>
+    <w:p>
+      <w:pPr>
         <w:pStyle w:val="1"/>
         <w:spacing w:before="0"/>
       </w:pPr>
-      <w:bookmarkStart w:id="1" w:name="_Toc231119251"/>
+      <w:bookmarkStart w:id="1" w:name="_Toc231830939"/>
       <w:r>
         <w:lastRenderedPageBreak/>
         <w:t xml:space="preserve">ГЛАВА </w:t>
@@ -2823,7 +2845,7 @@
         <w:pStyle w:val="2"/>
         <w:spacing w:before="0"/>
       </w:pPr>
-      <w:bookmarkStart w:id="2" w:name="_Toc231119252"/>
+      <w:bookmarkStart w:id="2" w:name="_Toc231830940"/>
       <w:r>
         <w:t>1.1 Описание предметной области и бизнес-процессов багетной мастерской</w:t>
       </w:r>
@@ -3543,7 +3565,7 @@
         <w:pStyle w:val="2"/>
         <w:spacing w:before="0"/>
       </w:pPr>
-      <w:bookmarkStart w:id="3" w:name="_Toc231119253"/>
+      <w:bookmarkStart w:id="3" w:name="_Toc231830941"/>
       <w:r>
         <w:t>1.2 Анализ требований к автоматизированной информационной системе</w:t>
       </w:r>
@@ -4252,7 +4274,7 @@
         <w:pStyle w:val="2"/>
         <w:spacing w:before="0"/>
       </w:pPr>
-      <w:bookmarkStart w:id="4" w:name="_Toc231119254"/>
+      <w:bookmarkStart w:id="4" w:name="_Toc231830942"/>
       <w:r>
         <w:t>1.3 Обоснование выбора программных средств, стека технологий и средств DevOps</w:t>
       </w:r>
@@ -4593,13 +4615,16 @@
         <w:pStyle w:val="1"/>
         <w:spacing w:before="0"/>
       </w:pPr>
-      <w:bookmarkStart w:id="5" w:name="_Toc231119255"/>
+      <w:bookmarkStart w:id="5" w:name="_Toc231830943"/>
       <w:r>
         <w:lastRenderedPageBreak/>
         <w:t xml:space="preserve">ГЛАВА </w:t>
       </w:r>
       <w:r>
-        <w:t>2 РАЗРАБОТКА ИНФОРМАЦИОННОЙ СИСТЕМЫ</w:t>
+        <w:t xml:space="preserve">2 </w:t>
+      </w:r>
+      <w:r>
+        <w:t>РАЗРАБОТКА АВТОМАТИЗИРОВАННОЙ СИСТЕМЫ ДЛЯ БАГЕТНОЙ МАСТЕРСКОЙ</w:t>
       </w:r>
       <w:bookmarkEnd w:id="5"/>
     </w:p>
@@ -4614,7 +4639,7 @@
         <w:pStyle w:val="2"/>
         <w:spacing w:before="0"/>
       </w:pPr>
-      <w:bookmarkStart w:id="6" w:name="_Toc231119256"/>
+      <w:bookmarkStart w:id="6" w:name="_Toc231830944"/>
       <w:r>
         <w:t>2.1 Проектирование архитектуры</w:t>
       </w:r>
@@ -5403,23 +5428,23 @@
           <w:sz w:val="28"/>
           <w:szCs w:val="28"/>
         </w:rPr>
-        <w:t>В качестве примера реализации логики инициализации таблиц ниже представлен листинг программного кода создания системной таблицы пользователей с применением SQL-запроса внутри метода генерации структуры</w:t>
-      </w:r>
-      <w:r>
-        <w:rPr>
-          <w:rFonts w:ascii="Times New Roman" w:hAnsi="Times New Roman" w:cs="Times New Roman"/>
-          <w:sz w:val="28"/>
-          <w:szCs w:val="28"/>
-        </w:rPr>
-        <w:t xml:space="preserve"> [11]</w:t>
-      </w:r>
-      <w:r>
-        <w:rPr>
-          <w:rFonts w:ascii="Times New Roman" w:hAnsi="Times New Roman" w:cs="Times New Roman"/>
-          <w:sz w:val="28"/>
-          <w:szCs w:val="28"/>
-        </w:rPr>
-        <w:t>.</w:t>
+        <w:t xml:space="preserve">В качестве примера реализации логики инициализации таблиц </w:t>
+      </w:r>
+      <w:r>
+        <w:rPr>
+          <w:rFonts w:ascii="Times New Roman" w:hAnsi="Times New Roman" w:cs="Times New Roman"/>
+          <w:sz w:val="28"/>
+          <w:szCs w:val="28"/>
+        </w:rPr>
+        <w:t xml:space="preserve">в </w:t>
+      </w:r>
+      <w:r>
+        <w:rPr>
+          <w:rFonts w:ascii="Times New Roman" w:hAnsi="Times New Roman" w:cs="Times New Roman"/>
+          <w:sz w:val="28"/>
+          <w:szCs w:val="28"/>
+        </w:rPr>
+        <w:t>листинге 1 представлен программный код создания системной таблицы пользователей с применением SQL-запроса внутри метода генерации структуры [11].</w:t>
       </w:r>
     </w:p>
     <w:p>
@@ -15394,7 +15419,7 @@
           <w:rFonts w:cs="Times New Roman"/>
         </w:rPr>
       </w:pPr>
-      <w:bookmarkStart w:id="7" w:name="_Toc231119257"/>
+      <w:bookmarkStart w:id="7" w:name="_Toc231830945"/>
       <w:r>
         <w:rPr>
           <w:rFonts w:cs="Times New Roman"/>
@@ -20582,7 +20607,7 @@
       <w:pPr>
         <w:pStyle w:val="2"/>
       </w:pPr>
-      <w:bookmarkStart w:id="9" w:name="_Toc231119258"/>
+      <w:bookmarkStart w:id="9" w:name="_Toc231830946"/>
       <w:r>
         <w:t>2.3 Руководство пользователя на примере оформления заказа</w:t>
       </w:r>
@@ -21722,7 +21747,7 @@
         <w:pStyle w:val="2"/>
         <w:spacing w:before="0"/>
       </w:pPr>
-      <w:bookmarkStart w:id="10" w:name="_Toc231119259"/>
+      <w:bookmarkStart w:id="10" w:name="_Toc231830947"/>
       <w:r>
         <w:t>2.</w:t>
       </w:r>
@@ -23512,7 +23537,7 @@
         <w:ind w:firstLine="0"/>
         <w:jc w:val="center"/>
       </w:pPr>
-      <w:bookmarkStart w:id="11" w:name="_Toc231119260"/>
+      <w:bookmarkStart w:id="11" w:name="_Toc231830948"/>
       <w:r>
         <w:lastRenderedPageBreak/>
         <w:t>ЗАКЛЮЧЕНИЕ</w:t>
@@ -23642,7 +23667,7 @@
         <w:pStyle w:val="1"/>
         <w:jc w:val="center"/>
       </w:pPr>
-      <w:bookmarkStart w:id="12" w:name="_Toc231119261"/>
+      <w:bookmarkStart w:id="12" w:name="_Toc231830949"/>
       <w:r>
         <w:lastRenderedPageBreak/>
         <w:t>СПИСОК ИСПОЛЬЗОВАННЫХ ИСТОЧНИКОВ</w:t>
@@ -24775,7 +24800,7 @@
           <w:lang w:val="en-US"/>
         </w:rPr>
       </w:pPr>
-      <w:bookmarkStart w:id="13" w:name="_Toc231119262"/>
+      <w:bookmarkStart w:id="13" w:name="_Toc231830950"/>
       <w:r>
         <w:lastRenderedPageBreak/>
         <w:t>ПРИЛОЖЕНИЕ</w:t>
@@ -26651,7 +26676,7 @@
           <w:lang w:val="en-US"/>
         </w:rPr>
       </w:pPr>
-      <w:bookmarkStart w:id="15" w:name="_Toc231119263"/>
+      <w:bookmarkStart w:id="15" w:name="_Toc231830951"/>
       <w:r>
         <w:lastRenderedPageBreak/>
         <w:t>ПРИЛОЖЕНИЕ</w:t>
@@ -33613,7 +33638,7 @@
         <w:pStyle w:val="1"/>
         <w:jc w:val="center"/>
       </w:pPr>
-      <w:bookmarkStart w:id="16" w:name="_Toc231119264"/>
+      <w:bookmarkStart w:id="16" w:name="_Toc231830952"/>
       <w:r>
         <w:lastRenderedPageBreak/>
         <w:t>ПРИЛОЖЕНИЕ В</w:t>
@@ -34925,7 +34950,7 @@
         <w:pStyle w:val="1"/>
         <w:jc w:val="center"/>
       </w:pPr>
-      <w:bookmarkStart w:id="18" w:name="_Toc231119265"/>
+      <w:bookmarkStart w:id="18" w:name="_Toc231830953"/>
       <w:r>
         <w:lastRenderedPageBreak/>
         <w:t xml:space="preserve">ПРИЛОЖЕНИЕ </w:t>
@@ -38436,7 +38461,7 @@
         <w:pStyle w:val="1"/>
         <w:jc w:val="center"/>
       </w:pPr>
-      <w:bookmarkStart w:id="19" w:name="_Toc231119266"/>
+      <w:bookmarkStart w:id="19" w:name="_Toc231830954"/>
       <w:r>
         <w:lastRenderedPageBreak/>
         <w:t xml:space="preserve">ПРИЛОЖЕНИЕ </w:t>

</xml_diff>

<commit_message>
ready for defens v3
</commit_message>
<xml_diff>
--- a/docs/Дипломный проект.docx
+++ b/docs/Дипломный проект.docx
@@ -498,7 +498,7 @@
             </w:rPr>
             <w:fldChar w:fldCharType="separate"/>
           </w:r>
-          <w:hyperlink w:anchor="_Toc231119250" w:history="1">
+          <w:hyperlink w:anchor="_Toc231830938" w:history="1">
             <w:r>
               <w:rPr>
                 <w:rStyle w:val="aa"/>
@@ -537,7 +537,7 @@
                 <w:sz w:val="28"/>
                 <w:szCs w:val="28"/>
               </w:rPr>
-              <w:instrText xml:space="preserve"> PAGEREF _Toc231119250 \h </w:instrText>
+              <w:instrText xml:space="preserve"> PAGEREF _Toc231830938 \h </w:instrText>
             </w:r>
             <w:r>
               <w:rPr>
@@ -596,7 +596,7 @@
               <w:lang w:eastAsia="ru-RU"/>
             </w:rPr>
           </w:pPr>
-          <w:hyperlink w:anchor="_Toc231119251" w:history="1">
+          <w:hyperlink w:anchor="_Toc231830939" w:history="1">
             <w:r>
               <w:rPr>
                 <w:rStyle w:val="aa"/>
@@ -635,7 +635,7 @@
                 <w:sz w:val="28"/>
                 <w:szCs w:val="28"/>
               </w:rPr>
-              <w:instrText xml:space="preserve"> PAGEREF _Toc231119251 \h </w:instrText>
+              <w:instrText xml:space="preserve"> PAGEREF _Toc231830939 \h </w:instrText>
             </w:r>
             <w:r>
               <w:rPr>
@@ -695,7 +695,7 @@
               <w:lang w:eastAsia="ru-RU"/>
             </w:rPr>
           </w:pPr>
-          <w:hyperlink w:anchor="_Toc231119252" w:history="1">
+          <w:hyperlink w:anchor="_Toc231830940" w:history="1">
             <w:r>
               <w:rPr>
                 <w:rStyle w:val="aa"/>
@@ -734,7 +734,7 @@
                 <w:sz w:val="28"/>
                 <w:szCs w:val="28"/>
               </w:rPr>
-              <w:instrText xml:space="preserve"> PAGEREF _Toc231119252 \h </w:instrText>
+              <w:instrText xml:space="preserve"> PAGEREF _Toc231830940 \h </w:instrText>
             </w:r>
             <w:r>
               <w:rPr>
@@ -794,7 +794,7 @@
               <w:lang w:eastAsia="ru-RU"/>
             </w:rPr>
           </w:pPr>
-          <w:hyperlink w:anchor="_Toc231119253" w:history="1">
+          <w:hyperlink w:anchor="_Toc231830941" w:history="1">
             <w:r>
               <w:rPr>
                 <w:rStyle w:val="aa"/>
@@ -833,7 +833,7 @@
                 <w:sz w:val="28"/>
                 <w:szCs w:val="28"/>
               </w:rPr>
-              <w:instrText xml:space="preserve"> PAGEREF _Toc231119253 \h </w:instrText>
+              <w:instrText xml:space="preserve"> PAGEREF _Toc231830941 \h </w:instrText>
             </w:r>
             <w:r>
               <w:rPr>
@@ -893,7 +893,7 @@
               <w:lang w:eastAsia="ru-RU"/>
             </w:rPr>
           </w:pPr>
-          <w:hyperlink w:anchor="_Toc231119254" w:history="1">
+          <w:hyperlink w:anchor="_Toc231830942" w:history="1">
             <w:r>
               <w:rPr>
                 <w:rStyle w:val="aa"/>
@@ -932,7 +932,7 @@
                 <w:sz w:val="28"/>
                 <w:szCs w:val="28"/>
               </w:rPr>
-              <w:instrText xml:space="preserve"> PAGEREF _Toc231119254 \h </w:instrText>
+              <w:instrText xml:space="preserve"> PAGEREF _Toc231830942 \h </w:instrText>
             </w:r>
             <w:r>
               <w:rPr>
@@ -991,7 +991,7 @@
               <w:lang w:eastAsia="ru-RU"/>
             </w:rPr>
           </w:pPr>
-          <w:hyperlink w:anchor="_Toc231119255" w:history="1">
+          <w:hyperlink w:anchor="_Toc231830943" w:history="1">
             <w:r>
               <w:rPr>
                 <w:rStyle w:val="aa"/>
@@ -1000,7 +1000,7 @@
                 <w:sz w:val="28"/>
                 <w:szCs w:val="28"/>
               </w:rPr>
-              <w:t>ГЛАВА 2 РАЗРАБОТКА ИНФОРМАЦИОННОЙ СИСТЕМЫ</w:t>
+              <w:t>ГЛАВА 2 РАЗРАБОТКА АВТОМАТИЗИРОВАННОЙ СИСТЕМЫ ДЛЯ БАГЕТНОЙ МАСТЕРСКОЙ</w:t>
             </w:r>
             <w:r>
               <w:rPr>
@@ -1030,7 +1030,7 @@
                 <w:sz w:val="28"/>
                 <w:szCs w:val="28"/>
               </w:rPr>
-              <w:instrText xml:space="preserve"> PAGEREF _Toc231119255 \h </w:instrText>
+              <w:instrText xml:space="preserve"> PAGEREF _Toc231830943 \h </w:instrText>
             </w:r>
             <w:r>
               <w:rPr>
@@ -1090,7 +1090,7 @@
               <w:lang w:eastAsia="ru-RU"/>
             </w:rPr>
           </w:pPr>
-          <w:hyperlink w:anchor="_Toc231119256" w:history="1">
+          <w:hyperlink w:anchor="_Toc231830944" w:history="1">
             <w:r>
               <w:rPr>
                 <w:rStyle w:val="aa"/>
@@ -1129,7 +1129,7 @@
                 <w:sz w:val="28"/>
                 <w:szCs w:val="28"/>
               </w:rPr>
-              <w:instrText xml:space="preserve"> PAGEREF _Toc231119256 \h </w:instrText>
+              <w:instrText xml:space="preserve"> PAGEREF _Toc231830944 \h </w:instrText>
             </w:r>
             <w:r>
               <w:rPr>
@@ -1189,7 +1189,7 @@
               <w:lang w:eastAsia="ru-RU"/>
             </w:rPr>
           </w:pPr>
-          <w:hyperlink w:anchor="_Toc231119257" w:history="1">
+          <w:hyperlink w:anchor="_Toc231830945" w:history="1">
             <w:r>
               <w:rPr>
                 <w:rStyle w:val="aa"/>
@@ -1228,7 +1228,7 @@
                 <w:sz w:val="28"/>
                 <w:szCs w:val="28"/>
               </w:rPr>
-              <w:instrText xml:space="preserve"> PAGEREF _Toc231119257 \h </w:instrText>
+              <w:instrText xml:space="preserve"> PAGEREF _Toc231830945 \h </w:instrText>
             </w:r>
             <w:r>
               <w:rPr>
@@ -1288,7 +1288,7 @@
               <w:lang w:eastAsia="ru-RU"/>
             </w:rPr>
           </w:pPr>
-          <w:hyperlink w:anchor="_Toc231119258" w:history="1">
+          <w:hyperlink w:anchor="_Toc231830946" w:history="1">
             <w:r>
               <w:rPr>
                 <w:rStyle w:val="aa"/>
@@ -1327,7 +1327,7 @@
                 <w:sz w:val="28"/>
                 <w:szCs w:val="28"/>
               </w:rPr>
-              <w:instrText xml:space="preserve"> PAGEREF _Toc231119258 \h </w:instrText>
+              <w:instrText xml:space="preserve"> PAGEREF _Toc231830946 \h </w:instrText>
             </w:r>
             <w:r>
               <w:rPr>
@@ -1387,7 +1387,7 @@
               <w:lang w:eastAsia="ru-RU"/>
             </w:rPr>
           </w:pPr>
-          <w:hyperlink w:anchor="_Toc231119259" w:history="1">
+          <w:hyperlink w:anchor="_Toc231830947" w:history="1">
             <w:r>
               <w:rPr>
                 <w:rStyle w:val="aa"/>
@@ -1426,7 +1426,7 @@
                 <w:sz w:val="28"/>
                 <w:szCs w:val="28"/>
               </w:rPr>
-              <w:instrText xml:space="preserve"> PAGEREF _Toc231119259 \h </w:instrText>
+              <w:instrText xml:space="preserve"> PAGEREF _Toc231830947 \h </w:instrText>
             </w:r>
             <w:r>
               <w:rPr>
@@ -1485,7 +1485,7 @@
               <w:lang w:eastAsia="ru-RU"/>
             </w:rPr>
           </w:pPr>
-          <w:hyperlink w:anchor="_Toc231119260" w:history="1">
+          <w:hyperlink w:anchor="_Toc231830948" w:history="1">
             <w:r>
               <w:rPr>
                 <w:rStyle w:val="aa"/>
@@ -1524,7 +1524,7 @@
                 <w:sz w:val="28"/>
                 <w:szCs w:val="28"/>
               </w:rPr>
-              <w:instrText xml:space="preserve"> PAGEREF _Toc231119260 \h </w:instrText>
+              <w:instrText xml:space="preserve"> PAGEREF _Toc231830948 \h </w:instrText>
             </w:r>
             <w:r>
               <w:rPr>
@@ -1583,7 +1583,7 @@
               <w:lang w:eastAsia="ru-RU"/>
             </w:rPr>
           </w:pPr>
-          <w:hyperlink w:anchor="_Toc231119261" w:history="1">
+          <w:hyperlink w:anchor="_Toc231830949" w:history="1">
             <w:r>
               <w:rPr>
                 <w:rStyle w:val="aa"/>
@@ -1622,7 +1622,7 @@
                 <w:sz w:val="28"/>
                 <w:szCs w:val="28"/>
               </w:rPr>
-              <w:instrText xml:space="preserve"> PAGEREF _Toc231119261 \h </w:instrText>
+              <w:instrText xml:space="preserve"> PAGEREF _Toc231830949 \h </w:instrText>
             </w:r>
             <w:r>
               <w:rPr>
@@ -1681,7 +1681,7 @@
               <w:lang w:eastAsia="ru-RU"/>
             </w:rPr>
           </w:pPr>
-          <w:hyperlink w:anchor="_Toc231119262" w:history="1">
+          <w:hyperlink w:anchor="_Toc231830950" w:history="1">
             <w:r>
               <w:rPr>
                 <w:rStyle w:val="aa"/>
@@ -1741,7 +1741,7 @@
                 <w:sz w:val="28"/>
                 <w:szCs w:val="28"/>
               </w:rPr>
-              <w:instrText xml:space="preserve"> PAGEREF _Toc231119262 \h </w:instrText>
+              <w:instrText xml:space="preserve"> PAGEREF _Toc231830950 \h </w:instrText>
             </w:r>
             <w:r>
               <w:rPr>
@@ -1800,7 +1800,7 @@
               <w:lang w:eastAsia="ru-RU"/>
             </w:rPr>
           </w:pPr>
-          <w:hyperlink w:anchor="_Toc231119263" w:history="1">
+          <w:hyperlink w:anchor="_Toc231830951" w:history="1">
             <w:r>
               <w:rPr>
                 <w:rStyle w:val="aa"/>
@@ -1860,7 +1860,7 @@
                 <w:sz w:val="28"/>
                 <w:szCs w:val="28"/>
               </w:rPr>
-              <w:instrText xml:space="preserve"> PAGEREF _Toc231119263 \h </w:instrText>
+              <w:instrText xml:space="preserve"> PAGEREF _Toc231830951 \h </w:instrText>
             </w:r>
             <w:r>
               <w:rPr>
@@ -1919,7 +1919,7 @@
               <w:lang w:eastAsia="ru-RU"/>
             </w:rPr>
           </w:pPr>
-          <w:hyperlink w:anchor="_Toc231119264" w:history="1">
+          <w:hyperlink w:anchor="_Toc231830952" w:history="1">
             <w:r>
               <w:rPr>
                 <w:rStyle w:val="aa"/>
@@ -1958,7 +1958,7 @@
                 <w:sz w:val="28"/>
                 <w:szCs w:val="28"/>
               </w:rPr>
-              <w:instrText xml:space="preserve"> PAGEREF _Toc231119264 \h </w:instrText>
+              <w:instrText xml:space="preserve"> PAGEREF _Toc231830952 \h </w:instrText>
             </w:r>
             <w:r>
               <w:rPr>
@@ -2017,7 +2017,7 @@
               <w:lang w:eastAsia="ru-RU"/>
             </w:rPr>
           </w:pPr>
-          <w:hyperlink w:anchor="_Toc231119265" w:history="1">
+          <w:hyperlink w:anchor="_Toc231830953" w:history="1">
             <w:r>
               <w:rPr>
                 <w:rStyle w:val="aa"/>
@@ -2056,7 +2056,7 @@
                 <w:sz w:val="28"/>
                 <w:szCs w:val="28"/>
               </w:rPr>
-              <w:instrText xml:space="preserve"> PAGEREF _Toc231119265 \h </w:instrText>
+              <w:instrText xml:space="preserve"> PAGEREF _Toc231830953 \h </w:instrText>
             </w:r>
             <w:r>
               <w:rPr>
@@ -2115,7 +2115,7 @@
               <w:lang w:eastAsia="ru-RU"/>
             </w:rPr>
           </w:pPr>
-          <w:hyperlink w:anchor="_Toc231119266" w:history="1">
+          <w:hyperlink w:anchor="_Toc231830954" w:history="1">
             <w:r>
               <w:rPr>
                 <w:rStyle w:val="aa"/>
@@ -2154,7 +2154,7 @@
                 <w:sz w:val="28"/>
                 <w:szCs w:val="28"/>
               </w:rPr>
-              <w:instrText xml:space="preserve"> PAGEREF _Toc231119266 \h </w:instrText>
+              <w:instrText xml:space="preserve"> PAGEREF _Toc231830954 \h </w:instrText>
             </w:r>
             <w:r>
               <w:rPr>
@@ -2245,7 +2245,7 @@
         <w:ind w:firstLine="0"/>
         <w:jc w:val="center"/>
       </w:pPr>
-      <w:bookmarkStart w:id="0" w:name="_Toc231119250"/>
+      <w:bookmarkStart w:id="0" w:name="_Toc231830938"/>
       <w:r>
         <w:lastRenderedPageBreak/>
         <w:t>ВВЕДЕНИЕ</w:t>
@@ -2781,28 +2781,50 @@
     </w:p>
     <w:p>
       <w:pPr>
-        <w:spacing w:line="360" w:lineRule="auto"/>
-        <w:rPr>
-          <w:rFonts w:ascii="Times New Roman" w:hAnsi="Times New Roman" w:cs="Times New Roman"/>
-          <w:sz w:val="28"/>
-          <w:szCs w:val="28"/>
-        </w:rPr>
-      </w:pPr>
-      <w:r>
-        <w:rPr>
-          <w:rFonts w:ascii="Times New Roman" w:hAnsi="Times New Roman" w:cs="Times New Roman"/>
-          <w:sz w:val="28"/>
-          <w:szCs w:val="28"/>
-        </w:rPr>
-        <w:br w:type="page"/>
+        <w:spacing w:after="0" w:line="360" w:lineRule="auto"/>
+        <w:ind w:firstLine="709"/>
+        <w:jc w:val="both"/>
+        <w:rPr>
+          <w:rFonts w:ascii="Times New Roman" w:hAnsi="Times New Roman" w:cs="Times New Roman"/>
+          <w:sz w:val="28"/>
+          <w:szCs w:val="28"/>
+        </w:rPr>
+      </w:pPr>
+      <w:r>
+        <w:rPr>
+          <w:rFonts w:ascii="Times New Roman" w:hAnsi="Times New Roman" w:cs="Times New Roman"/>
+          <w:bCs/>
+          <w:color w:val="000000" w:themeColor="text1"/>
+          <w:sz w:val="28"/>
+          <w:szCs w:val="28"/>
+        </w:rPr>
+        <w:t>Структура работы: работа состоит из введения, двух глав, заключения, списка используемых источников и пяти приложений. Во введении обоснована актуальность темы. В первой главе описан анализ предметной области багетной мастерской и выбор средств разработки. Вторая глава посвящена проектированию архитектуры, разработке интерфейса, руководству пользователя и тестированию. Заключение отражает результат достижения цели работы. Список используемых источников насчитывает 20 источников.</w:t>
       </w:r>
     </w:p>
     <w:p>
       <w:pPr>
+        <w:spacing w:line="360" w:lineRule="auto"/>
+        <w:rPr>
+          <w:rFonts w:ascii="Times New Roman" w:hAnsi="Times New Roman" w:cs="Times New Roman"/>
+          <w:sz w:val="28"/>
+          <w:szCs w:val="28"/>
+        </w:rPr>
+      </w:pPr>
+      <w:r>
+        <w:rPr>
+          <w:rFonts w:ascii="Times New Roman" w:hAnsi="Times New Roman" w:cs="Times New Roman"/>
+          <w:sz w:val="28"/>
+          <w:szCs w:val="28"/>
+        </w:rPr>
+        <w:br w:type="page"/>
+      </w:r>
+    </w:p>
+    <w:p>
+      <w:pPr>
         <w:pStyle w:val="1"/>
         <w:spacing w:before="0"/>
       </w:pPr>
-      <w:bookmarkStart w:id="1" w:name="_Toc231119251"/>
+      <w:bookmarkStart w:id="1" w:name="_Toc231830939"/>
       <w:r>
         <w:lastRenderedPageBreak/>
         <w:t xml:space="preserve">ГЛАВА </w:t>
@@ -2823,7 +2845,7 @@
         <w:pStyle w:val="2"/>
         <w:spacing w:before="0"/>
       </w:pPr>
-      <w:bookmarkStart w:id="2" w:name="_Toc231119252"/>
+      <w:bookmarkStart w:id="2" w:name="_Toc231830940"/>
       <w:r>
         <w:t>1.1 Описание предметной области и бизнес-процессов багетной мастерской</w:t>
       </w:r>
@@ -3543,7 +3565,7 @@
         <w:pStyle w:val="2"/>
         <w:spacing w:before="0"/>
       </w:pPr>
-      <w:bookmarkStart w:id="3" w:name="_Toc231119253"/>
+      <w:bookmarkStart w:id="3" w:name="_Toc231830941"/>
       <w:r>
         <w:t>1.2 Анализ требований к автоматизированной информационной системе</w:t>
       </w:r>
@@ -4252,7 +4274,7 @@
         <w:pStyle w:val="2"/>
         <w:spacing w:before="0"/>
       </w:pPr>
-      <w:bookmarkStart w:id="4" w:name="_Toc231119254"/>
+      <w:bookmarkStart w:id="4" w:name="_Toc231830942"/>
       <w:r>
         <w:t>1.3 Обоснование выбора программных средств, стека технологий и средств DevOps</w:t>
       </w:r>
@@ -4593,13 +4615,16 @@
         <w:pStyle w:val="1"/>
         <w:spacing w:before="0"/>
       </w:pPr>
-      <w:bookmarkStart w:id="5" w:name="_Toc231119255"/>
+      <w:bookmarkStart w:id="5" w:name="_Toc231830943"/>
       <w:r>
         <w:lastRenderedPageBreak/>
         <w:t xml:space="preserve">ГЛАВА </w:t>
       </w:r>
       <w:r>
-        <w:t>2 РАЗРАБОТКА ИНФОРМАЦИОННОЙ СИСТЕМЫ</w:t>
+        <w:t xml:space="preserve">2 </w:t>
+      </w:r>
+      <w:r>
+        <w:t>РАЗРАБОТКА АВТОМАТИЗИРОВАННОЙ СИСТЕМЫ ДЛЯ БАГЕТНОЙ МАСТЕРСКОЙ</w:t>
       </w:r>
       <w:bookmarkEnd w:id="5"/>
     </w:p>
@@ -4614,7 +4639,7 @@
         <w:pStyle w:val="2"/>
         <w:spacing w:before="0"/>
       </w:pPr>
-      <w:bookmarkStart w:id="6" w:name="_Toc231119256"/>
+      <w:bookmarkStart w:id="6" w:name="_Toc231830944"/>
       <w:r>
         <w:t>2.1 Проектирование архитектуры</w:t>
       </w:r>
@@ -5403,23 +5428,23 @@
           <w:sz w:val="28"/>
           <w:szCs w:val="28"/>
         </w:rPr>
-        <w:t>В качестве примера реализации логики инициализации таблиц ниже представлен листинг программного кода создания системной таблицы пользователей с применением SQL-запроса внутри метода генерации структуры</w:t>
-      </w:r>
-      <w:r>
-        <w:rPr>
-          <w:rFonts w:ascii="Times New Roman" w:hAnsi="Times New Roman" w:cs="Times New Roman"/>
-          <w:sz w:val="28"/>
-          <w:szCs w:val="28"/>
-        </w:rPr>
-        <w:t xml:space="preserve"> [11]</w:t>
-      </w:r>
-      <w:r>
-        <w:rPr>
-          <w:rFonts w:ascii="Times New Roman" w:hAnsi="Times New Roman" w:cs="Times New Roman"/>
-          <w:sz w:val="28"/>
-          <w:szCs w:val="28"/>
-        </w:rPr>
-        <w:t>.</w:t>
+        <w:t xml:space="preserve">В качестве примера реализации логики инициализации таблиц </w:t>
+      </w:r>
+      <w:r>
+        <w:rPr>
+          <w:rFonts w:ascii="Times New Roman" w:hAnsi="Times New Roman" w:cs="Times New Roman"/>
+          <w:sz w:val="28"/>
+          <w:szCs w:val="28"/>
+        </w:rPr>
+        <w:t xml:space="preserve">в </w:t>
+      </w:r>
+      <w:r>
+        <w:rPr>
+          <w:rFonts w:ascii="Times New Roman" w:hAnsi="Times New Roman" w:cs="Times New Roman"/>
+          <w:sz w:val="28"/>
+          <w:szCs w:val="28"/>
+        </w:rPr>
+        <w:t>листинге 1 представлен программный код создания системной таблицы пользователей с применением SQL-запроса внутри метода генерации структуры [11].</w:t>
       </w:r>
     </w:p>
     <w:p>
@@ -15394,7 +15419,7 @@
           <w:rFonts w:cs="Times New Roman"/>
         </w:rPr>
       </w:pPr>
-      <w:bookmarkStart w:id="7" w:name="_Toc231119257"/>
+      <w:bookmarkStart w:id="7" w:name="_Toc231830945"/>
       <w:r>
         <w:rPr>
           <w:rFonts w:cs="Times New Roman"/>
@@ -20582,7 +20607,7 @@
       <w:pPr>
         <w:pStyle w:val="2"/>
       </w:pPr>
-      <w:bookmarkStart w:id="9" w:name="_Toc231119258"/>
+      <w:bookmarkStart w:id="9" w:name="_Toc231830946"/>
       <w:r>
         <w:t>2.3 Руководство пользователя на примере оформления заказа</w:t>
       </w:r>
@@ -21722,7 +21747,7 @@
         <w:pStyle w:val="2"/>
         <w:spacing w:before="0"/>
       </w:pPr>
-      <w:bookmarkStart w:id="10" w:name="_Toc231119259"/>
+      <w:bookmarkStart w:id="10" w:name="_Toc231830947"/>
       <w:r>
         <w:t>2.</w:t>
       </w:r>
@@ -23512,7 +23537,7 @@
         <w:ind w:firstLine="0"/>
         <w:jc w:val="center"/>
       </w:pPr>
-      <w:bookmarkStart w:id="11" w:name="_Toc231119260"/>
+      <w:bookmarkStart w:id="11" w:name="_Toc231830948"/>
       <w:r>
         <w:lastRenderedPageBreak/>
         <w:t>ЗАКЛЮЧЕНИЕ</w:t>
@@ -23642,7 +23667,7 @@
         <w:pStyle w:val="1"/>
         <w:jc w:val="center"/>
       </w:pPr>
-      <w:bookmarkStart w:id="12" w:name="_Toc231119261"/>
+      <w:bookmarkStart w:id="12" w:name="_Toc231830949"/>
       <w:r>
         <w:lastRenderedPageBreak/>
         <w:t>СПИСОК ИСПОЛЬЗОВАННЫХ ИСТОЧНИКОВ</w:t>
@@ -24775,7 +24800,7 @@
           <w:lang w:val="en-US"/>
         </w:rPr>
       </w:pPr>
-      <w:bookmarkStart w:id="13" w:name="_Toc231119262"/>
+      <w:bookmarkStart w:id="13" w:name="_Toc231830950"/>
       <w:r>
         <w:lastRenderedPageBreak/>
         <w:t>ПРИЛОЖЕНИЕ</w:t>
@@ -26651,7 +26676,7 @@
           <w:lang w:val="en-US"/>
         </w:rPr>
       </w:pPr>
-      <w:bookmarkStart w:id="15" w:name="_Toc231119263"/>
+      <w:bookmarkStart w:id="15" w:name="_Toc231830951"/>
       <w:r>
         <w:lastRenderedPageBreak/>
         <w:t>ПРИЛОЖЕНИЕ</w:t>
@@ -33613,7 +33638,7 @@
         <w:pStyle w:val="1"/>
         <w:jc w:val="center"/>
       </w:pPr>
-      <w:bookmarkStart w:id="16" w:name="_Toc231119264"/>
+      <w:bookmarkStart w:id="16" w:name="_Toc231830952"/>
       <w:r>
         <w:lastRenderedPageBreak/>
         <w:t>ПРИЛОЖЕНИЕ В</w:t>
@@ -34925,7 +34950,7 @@
         <w:pStyle w:val="1"/>
         <w:jc w:val="center"/>
       </w:pPr>
-      <w:bookmarkStart w:id="18" w:name="_Toc231119265"/>
+      <w:bookmarkStart w:id="18" w:name="_Toc231830953"/>
       <w:r>
         <w:lastRenderedPageBreak/>
         <w:t xml:space="preserve">ПРИЛОЖЕНИЕ </w:t>
@@ -38436,7 +38461,7 @@
         <w:pStyle w:val="1"/>
         <w:jc w:val="center"/>
       </w:pPr>
-      <w:bookmarkStart w:id="19" w:name="_Toc231119266"/>
+      <w:bookmarkStart w:id="19" w:name="_Toc231830954"/>
       <w:r>
         <w:lastRenderedPageBreak/>
         <w:t xml:space="preserve">ПРИЛОЖЕНИЕ </w:t>

</xml_diff>